<commit_message>
docs: complete logbook 1 with evidence-based rows for every activity
Teammates now confirm or correct their row instead of writing it.

Co-Authored-By: Claude Opus 5.5 <noreply@anthropic.com>
</commit_message>
<xml_diff>
--- a/knowledge/projects/entregas/bitacora-1.docx
+++ b/knowledge/projects/entregas/bitacora-1.docx
@@ -135,7 +135,7 @@
           <w:i w:val="0"/>
           <w:color w:val="141B24"/>
         </w:rPr>
-        <w:t>Están implementados y testeados la base compartida y los módulos de percepción y geometría: ingesta y configuración (M1), detección con YOLOv8n y seguimiento con ByteTrack (M2), y homografía, carriles, trayectorias causales y relaciones viales con THW y TTC (M3). Tienen 57 tests unitarios que cubren los casos límite de §2.5 que les corresponden. Además existe la referencia de reglas sobre trayectorias reales de NGSIM y el cálculo de F1 de eventos (M6), con 21 tests. Faltan el motor de reglas (M4), las salidas (M5), la integración y las mediciones de §2.5.</w:t>
+        <w:t>Están implementados y testeados la base compartida y los módulos de percepción y geometría: ingesta y configuración (M1), detección con YOLOv8n y seguimiento con ByteTrack (M2), y homografía, carriles, trayectorias causales y relaciones viales con THW y TTC (M3). Tienen 57 tests unitarios que cubren los casos límite de §2.5 que les corresponden. Además existe la referencia de reglas sobre trayectorias reales de NGSIM y el cálculo de F1 de eventos (M6), con 23 tests. En total hay 80 tests. Faltan el motor de reglas (M4), las salidas (M5), la integración y las mediciones de §2.5.</w:t>
       </w:r>
     </w:p>
     <w:p>
@@ -387,21 +387,11 @@
               <w:rPr>
                 <w:rFonts w:ascii="Arial" w:hAnsi="Arial"/>
                 <w:b w:val="0"/>
-                <w:i/>
-                <w:color w:val="141B24"/>
-                <w:sz w:val="18"/>
-              </w:rPr>
-              <w:t>Completar.</w:t>
-            </w:r>
-            <w:r>
-              <w:rPr>
-                <w:rFonts w:ascii="Arial" w:hAnsi="Arial"/>
-                <w:b w:val="0"/>
                 <w:i w:val="0"/>
                 <w:color w:val="141B24"/>
                 <w:sz w:val="18"/>
               </w:rPr>
-              <w:t xml:space="preserve"> Base sugerida: YOLOv8n con mapeo explícito COCO → clases, filtro por región de interés, ByteTrack con ID persistente y oclusiones breves</w:t>
+              <w:t>YOLOv8n preentrenado con mapeo explícito COCO → automóvil, bus, camión y motocicleta, y filtro por región de interés. ByteTrack implementado sobre NumPy y SciPy, independiente del detector: filtro de Kalman, doble asociación por confianza (la de confianza baja recupera vehículos parcialmente ocluidos) y un buffer que conserva el ID durante oclusiones breves. Además implementó el contrato de datos y M1</w:t>
             </w:r>
           </w:p>
         </w:tc>
@@ -438,7 +428,7 @@
                 <w:color w:val="141B24"/>
                 <w:sz w:val="18"/>
               </w:rPr>
-              <w:t>, tests</w:t>
+              <w:t>, 10 tests</w:t>
             </w:r>
           </w:p>
         </w:tc>
@@ -487,21 +477,11 @@
               <w:rPr>
                 <w:rFonts w:ascii="Arial" w:hAnsi="Arial"/>
                 <w:b w:val="0"/>
-                <w:i/>
-                <w:color w:val="141B24"/>
-                <w:sz w:val="18"/>
-              </w:rPr>
-              <w:t>Completar.</w:t>
-            </w:r>
-            <w:r>
-              <w:rPr>
-                <w:rFonts w:ascii="Arial" w:hAnsi="Arial"/>
-                <w:b w:val="0"/>
                 <w:i w:val="0"/>
                 <w:color w:val="141B24"/>
                 <w:sz w:val="18"/>
               </w:rPr>
-              <w:t xml:space="preserve"> Base sugerida: homografía, asignación de carril con confianza, confirmación de cambio completo, historial causal, THW y TTC</w:t>
+              <w:t>Homografía al plano del camino; sin calibración, los campos métricos quedan no disponibles. Asignación de carril con confianza y confirmación de cambio completo por permanencia. Suavizado causal por mínimos cuadrados en una ventana de 1 s, con reinicio del historial ante saltos imposibles. Predecesor y seguidor por carril, THW y TTC</w:t>
             </w:r>
           </w:p>
         </w:tc>
@@ -538,7 +518,7 @@
                 <w:color w:val="141B24"/>
                 <w:sz w:val="18"/>
               </w:rPr>
-              <w:t>, tests</w:t>
+              <w:t>, 28 tests (geometría, carriles, relaciones y robustez)</w:t>
             </w:r>
           </w:p>
         </w:tc>
@@ -587,11 +567,31 @@
               <w:rPr>
                 <w:rFonts w:ascii="Arial" w:hAnsi="Arial"/>
                 <w:b w:val="0"/>
-                <w:i/>
+                <w:i w:val="0"/>
                 <w:color w:val="141B24"/>
                 <w:sz w:val="18"/>
               </w:rPr>
-              <w:t>Completar.</w:t>
+              <w:t xml:space="preserve">Sin código en </w:t>
+            </w:r>
+            <w:r>
+              <w:rPr>
+                <w:rFonts w:ascii="Courier New" w:hAnsi="Courier New"/>
+                <w:b w:val="0"/>
+                <w:i w:val="0"/>
+                <w:color w:val="141B24"/>
+                <w:sz w:val="18"/>
+              </w:rPr>
+              <w:t>main</w:t>
+            </w:r>
+            <w:r>
+              <w:rPr>
+                <w:rFonts w:ascii="Arial" w:hAnsi="Arial"/>
+                <w:b w:val="0"/>
+                <w:i w:val="0"/>
+                <w:color w:val="141B24"/>
+                <w:sz w:val="18"/>
+              </w:rPr>
+              <w:t xml:space="preserve"> al 2026-10-18. Las reglas RF7–RF9 ya se pueden probar sobre trayectorias reales de NGSIM; el plan ajustado cierra M4 el 1-nov</w:t>
             </w:r>
           </w:p>
         </w:tc>
@@ -657,21 +657,11 @@
               <w:rPr>
                 <w:rFonts w:ascii="Arial" w:hAnsi="Arial"/>
                 <w:b w:val="0"/>
-                <w:i/>
-                <w:color w:val="141B24"/>
-                <w:sz w:val="18"/>
-              </w:rPr>
-              <w:t>Completar.</w:t>
-            </w:r>
-            <w:r>
-              <w:rPr>
-                <w:rFonts w:ascii="Arial" w:hAnsi="Arial"/>
-                <w:b w:val="0"/>
                 <w:i w:val="0"/>
                 <w:color w:val="141B24"/>
                 <w:sz w:val="18"/>
               </w:rPr>
-              <w:t xml:space="preserve"> Al 2026-10-17 no hay código en </w:t>
+              <w:t xml:space="preserve">Sin código en </w:t>
             </w:r>
             <w:r>
               <w:rPr>
@@ -691,7 +681,7 @@
                 <w:color w:val="141B24"/>
                 <w:sz w:val="18"/>
               </w:rPr>
-              <w:t>; el inicio previsto era el 12-oct</w:t>
+              <w:t xml:space="preserve"> al 2026-10-18; el inicio previsto era el 12-oct. En el reparto propuesto pasa a J (integración) y R (video y registros)</w:t>
             </w:r>
           </w:p>
         </w:tc>
@@ -1015,20 +1005,6 @@
           <w:color w:val="141B24"/>
         </w:rPr>
         <w:t>No está verificado si se solicitó acceso a highD el 14-sep.</w:t>
-      </w:r>
-    </w:p>
-    <w:p>
-      <w:pPr>
-        <w:pStyle w:val="ListBullet"/>
-      </w:pPr>
-      <w:r>
-        <w:rPr>
-          <w:rFonts w:ascii="Arial" w:hAnsi="Arial"/>
-          <w:b w:val="0"/>
-          <w:i/>
-          <w:color w:val="141B24"/>
-        </w:rPr>
-        <w:t>Completar por cada integrante.</w:t>
       </w:r>
     </w:p>
     <w:p>

</xml_diff>